<commit_message>
fix: correct IKKA chatbot description - serves senior officials via web app
</commit_message>
<xml_diff>
--- a/Mohamad-Zafir-Resume.docx
+++ b/Mohamad-Zafir-Resume.docx
@@ -610,7 +610,7 @@
           <w:sz w:val="20"/>
           <w:szCs w:val="20"/>
         </w:rPr>
-        <w:t xml:space="preserve">Built the chatbot researchers use to talk to that model.</w:t>
+        <w:t xml:space="preserve">Built that model into the IKKA web app as a chatbot, so senior officials can get quick answers and pull data without digging through reports.</w:t>
       </w:r>
     </w:p>
     <w:p>
@@ -1198,7 +1198,7 @@
           <w:sz w:val="20"/>
           <w:szCs w:val="20"/>
         </w:rPr>
-        <w:t xml:space="preserve">Fine-tuned a language model on IKKA domain knowledge, then built the chatbot researchers use to ask it questions.</w:t>
+        <w:t xml:space="preserve">Fine-tuned a language model on IKKA domain knowledge and built it into the app as a chatbot: senior officials ask a question, it answers with reference material and data.</w:t>
       </w:r>
     </w:p>
     <w:p>

</xml_diff>